<commit_message>
Resolve v2.32 cross-file consistency issues before submission.
Align table titles/order/captions, clarify ISO baseline and hand-check notes in the supplement, fix abstract counts and EN affiliation, and label Figure 3 panels.

Co-authored-by: Cursor <cursoragent@cursor.com>
</commit_message>
<xml_diff>
--- a/docs/pilot-study/manuscripts/Supplement1_verification.docx
+++ b/docs/pilot-study/manuscripts/Supplement1_verification.docx
@@ -88,7 +88,7 @@
     </w:p>
     <w:p>
       <w:r>
-        <w:t>規格本文の表は転載しない。実装した教育用JSONの気導中央値（dB HL）を示す。各年齢群の代表年齢は、ISO 7029:2017の式に代入した年齢として 20歳代＝20歳、30歳代＝30歳、40歳代＝40歳、50歳代＝50歳、60歳代＝60歳、70歳代＝70歳（各群の下限年齢）とした。ばらつき指標は、同JSONのminus2SD／plus2SD（ISO由来の±2SD相当帯）である。生成時は中央値を平均、帯域幅から近似したSDで正規乱数サンプリングし、帯域内にクリップしたうえで5 dB丸めと周波数別上下限を適用する。本文の「概ね±5～10 dB」はこの教育用サンプリングの要約であり、ISOのsu／sl式そのものの実装ではない。ISO 7029:2017の係数表は125 Hzならびに1.5・3・6 kHzを含む。本システムの生成周波数は0.125・0.25・0.5・1・2・4・8 kHzであり、1.5・3・6 kHzは未実装である。0.125 kHzはISO係数表に含まれるが、現行の参照JSONには0.25–8 kHzのみを格納しているため、実装上は0.25 kHzの参照値を流用し、周波数別の教育用上下限で拘束している（規格値の隣接帯補間ではない）。骨導基準はISOが直接規定するものではなく、気骨導関係の著者規則から生成する。</w:t>
+        <w:t>規格本文の表は転載しない。実装した教育用JSONの気導中央値（dB HL）を示す。教育用JSONでは、最若年帯である20歳代の中央値を0.0 dB HL（相対基準）として格納している。これはISO 7029:2017の式に年齢20歳を代入した厳密な期待中位値そのものではなく、教育用に20歳代を基準0とする相対表示である。30歳代以降の各年齢群の代表年齢は群の下限（30／40／50／60／70歳）とし、当該代表年齢に基づく教育用参照中央値を格納した。ばらつき指標は、同JSONのminus2SD／plus2SD（ISO由来の±2SD相当帯）である。生成時は中央値を平均、帯域幅から近似したSDで正規乱数サンプリングし、帯域内にクリップしたうえで5 dB丸めと周波数別上下限を適用する。このばらつき付与は教育用サンプリングであり、ISOのsu／sl式そのものの実装ではない。なお、気導の教育用下限は0.125／0.25／0.5 kHzで5 dBであるため、参照中央値が0.0 dBの20歳代では、低周波数の出力が下限5 dBにクリップされやすい（意図した教育用設計である）。ISO 7029:2017の係数表は125 Hzならびに1.5・3・6 kHzを含む。本システムの生成周波数は0.125・0.25・0.5・1・2・4・8 kHzであり、1.5・3・6 kHzは未実装である。0.125 kHzはISO係数表に含まれるが、現行の参照JSONには0.25–8 kHzのみを格納しているため、実装上は0.25 kHzの参照値を流用し、周波数別の教育用上下限で拘束している（規格値の隣接帯補間ではない）。骨導基準はISOが直接規定するものではなく、気骨導関係の著者規則から生成する。</w:t>
       </w:r>
     </w:p>
     <w:tbl>
@@ -1438,7 +1438,7 @@
     </w:tbl>
     <w:p>
       <w:r>
-        <w:t>注：0.125 kHz列は実装どおり0.25 kHz参照の流用値である。</w:t>
+        <w:t>注：0.125 kHz列は実装どおり0.25 kHz参照の流用値である。0.125／0.25／0.5 kHzの気導下限5 dBにより、20歳代では低周波数の出力が5 dB付近に寄りやすい。</w:t>
       </w:r>
     </w:p>
     <w:p>
@@ -2224,7 +2224,7 @@
           </w:tcPr>
           <w:p>
             <w:r>
-              <w:t>G4a</w:t>
+              <w:t>G3-Normal</w:t>
             </w:r>
           </w:p>
         </w:tc>
@@ -2234,7 +2234,7 @@
           </w:tcPr>
           <w:p>
             <w:r>
-              <w:t>周波数別上下限（症例単位：数値閾値がP4範囲内）</w:t>
+              <w:t>Normal: 過大ABGなし（症例単位）</w:t>
             </w:r>
           </w:p>
         </w:tc>
@@ -2244,7 +2244,7 @@
           </w:tcPr>
           <w:p>
             <w:r>
-              <w:t>9600/9600</w:t>
+              <w:t>960/960</w:t>
             </w:r>
           </w:p>
         </w:tc>
@@ -2254,7 +2254,7 @@
           </w:tcPr>
           <w:p>
             <w:r>
-              <w:t>9600</w:t>
+              <w:t>960</w:t>
             </w:r>
           </w:p>
         </w:tc>
@@ -2273,9 +2273,7 @@
             <w:tcW w:type="dxa" w:w="1440"/>
           </w:tcPr>
           <w:p>
-            <w:r>
-              <w:t>境界値＝上下限一致は適合。超過・下回は不適合</w:t>
-            </w:r>
+            <w:r/>
           </w:p>
         </w:tc>
       </w:tr>
@@ -2286,7 +2284,7 @@
           </w:tcPr>
           <w:p>
             <w:r>
-              <w:t>G4b</w:t>
+              <w:t>G3-SNHL</w:t>
             </w:r>
           </w:p>
         </w:tc>
@@ -2296,7 +2294,7 @@
           </w:tcPr>
           <w:p>
             <w:r>
-              <w:t>周波数別上下限（閾値点単位）</w:t>
+              <w:t>感音: BC≤AC+5（症例単位）</w:t>
             </w:r>
           </w:p>
         </w:tc>
@@ -2306,7 +2304,7 @@
           </w:tcPr>
           <w:p>
             <w:r>
-              <w:t>230400/230400</w:t>
+              <w:t>4800/4800</w:t>
             </w:r>
           </w:p>
         </w:tc>
@@ -2316,7 +2314,7 @@
           </w:tcPr>
           <w:p>
             <w:r>
-              <w:t>230400</w:t>
+              <w:t>4800</w:t>
             </w:r>
           </w:p>
         </w:tc>
@@ -2346,7 +2344,7 @@
           </w:tcPr>
           <w:p>
             <w:r>
-              <w:t>G3-Normal</w:t>
+              <w:t>G3-CHL</w:t>
             </w:r>
           </w:p>
         </w:tc>
@@ -2356,7 +2354,7 @@
           </w:tcPr>
           <w:p>
             <w:r>
-              <w:t>Normal: 過大ABGなし（症例単位）</w:t>
+              <w:t>伝音系4パターン: 最小ABG（症例単位。急性中耳炎の混合型を含む）</w:t>
             </w:r>
           </w:p>
         </w:tc>
@@ -2366,7 +2364,7 @@
           </w:tcPr>
           <w:p>
             <w:r>
-              <w:t>960/960</w:t>
+              <w:t>3840/3840</w:t>
             </w:r>
           </w:p>
         </w:tc>
@@ -2376,7 +2374,7 @@
           </w:tcPr>
           <w:p>
             <w:r>
-              <w:t>960</w:t>
+              <w:t>3840</w:t>
             </w:r>
           </w:p>
         </w:tc>
@@ -2406,7 +2404,7 @@
           </w:tcPr>
           <w:p>
             <w:r>
-              <w:t>G3-SNHL</w:t>
+              <w:t>G3-Noise</w:t>
             </w:r>
           </w:p>
         </w:tc>
@@ -2416,7 +2414,7 @@
           </w:tcPr>
           <w:p>
             <w:r>
-              <w:t>感音: BC≤AC+5（症例単位）</w:t>
+              <w:t>C5-dip: 4k≥2k+10 かつ 4k≥8k+10（程度≥1）</w:t>
             </w:r>
           </w:p>
         </w:tc>
@@ -2426,7 +2424,7 @@
           </w:tcPr>
           <w:p>
             <w:r>
-              <w:t>4800/4800</w:t>
+              <w:t>720/720</w:t>
             </w:r>
           </w:p>
         </w:tc>
@@ -2436,7 +2434,7 @@
           </w:tcPr>
           <w:p>
             <w:r>
-              <w:t>4800</w:t>
+              <w:t>720</w:t>
             </w:r>
           </w:p>
         </w:tc>
@@ -2455,7 +2453,9 @@
             <w:tcW w:type="dxa" w:w="1440"/>
           </w:tcPr>
           <w:p>
-            <w:r/>
+            <w:r>
+              <w:t>Coles参考の著者設定（10 dB床）</w:t>
+            </w:r>
           </w:p>
         </w:tc>
       </w:tr>
@@ -2466,7 +2466,7 @@
           </w:tcPr>
           <w:p>
             <w:r>
-              <w:t>G3-CHL</w:t>
+              <w:t>G3-SuddenLat</w:t>
             </w:r>
           </w:p>
         </w:tc>
@@ -2476,7 +2476,7 @@
           </w:tcPr>
           <w:p>
             <w:r>
-              <w:t>伝音系4パターン: 最小ABG（症例単位。急性中耳炎の混合型を含む）</w:t>
+              <w:t>突発一側差≥30 dB（程度≥1・0.5/1/2 kHz平均）</w:t>
             </w:r>
           </w:p>
         </w:tc>
@@ -2486,7 +2486,7 @@
           </w:tcPr>
           <w:p>
             <w:r>
-              <w:t>3840/3840</w:t>
+              <w:t>720/720</w:t>
             </w:r>
           </w:p>
         </w:tc>
@@ -2496,7 +2496,7 @@
           </w:tcPr>
           <w:p>
             <w:r>
-              <w:t>3840</w:t>
+              <w:t>720</w:t>
             </w:r>
           </w:p>
         </w:tc>
@@ -2526,7 +2526,7 @@
           </w:tcPr>
           <w:p>
             <w:r>
-              <w:t>G3-Noise</w:t>
+              <w:t>G3-MumpsFloor</w:t>
             </w:r>
           </w:p>
         </w:tc>
@@ -2536,7 +2536,7 @@
           </w:tcPr>
           <w:p>
             <w:r>
-              <w:t>C5-dip: 4k≥2k+10 かつ 4k≥8k+10（程度≥1）</w:t>
+              <w:t>ムンプス: 病側meanAC≥70 かつ 一側差≥55（程度≥1）</w:t>
             </w:r>
           </w:p>
         </w:tc>
@@ -2575,9 +2575,7 @@
             <w:tcW w:type="dxa" w:w="1440"/>
           </w:tcPr>
           <w:p>
-            <w:r>
-              <w:t>Coles参考の著者設定（10 dB床）</w:t>
-            </w:r>
+            <w:r/>
           </w:p>
         </w:tc>
       </w:tr>
@@ -2588,7 +2586,7 @@
           </w:tcPr>
           <w:p>
             <w:r>
-              <w:t>G3-SuddenLat</w:t>
+              <w:t>G3-CarhartGeom</w:t>
             </w:r>
           </w:p>
         </w:tc>
@@ -2598,7 +2596,7 @@
           </w:tcPr>
           <w:p>
             <w:r>
-              <w:t>突発一側差≥30 dB（程度≥1・0.5/1/2 kHz平均）</w:t>
+              <w:t>Carhart様幾何（発現例のみ）</w:t>
             </w:r>
           </w:p>
         </w:tc>
@@ -2608,7 +2606,7 @@
           </w:tcPr>
           <w:p>
             <w:r>
-              <w:t>720/720</w:t>
+              <w:t>576/576</w:t>
             </w:r>
           </w:p>
         </w:tc>
@@ -2618,7 +2616,7 @@
           </w:tcPr>
           <w:p>
             <w:r>
-              <w:t>720</w:t>
+              <w:t>576</w:t>
             </w:r>
           </w:p>
         </w:tc>
@@ -2648,7 +2646,7 @@
           </w:tcPr>
           <w:p>
             <w:r>
-              <w:t>G3-MumpsFloor</w:t>
+              <w:t>G3-AOM-Mixed</w:t>
             </w:r>
           </w:p>
         </w:tc>
@@ -2658,7 +2656,7 @@
           </w:tcPr>
           <w:p>
             <w:r>
-              <w:t>ムンプス: 病側meanAC≥70 かつ 一側差≥55（程度≥1）</w:t>
+              <w:t>AOM混合型: 4k BC&gt;0.5k BC（付与例）</w:t>
             </w:r>
           </w:p>
         </w:tc>
@@ -2668,7 +2666,7 @@
           </w:tcPr>
           <w:p>
             <w:r>
-              <w:t>720/720</w:t>
+              <w:t>361/361</w:t>
             </w:r>
           </w:p>
         </w:tc>
@@ -2678,7 +2676,7 @@
           </w:tcPr>
           <w:p>
             <w:r>
-              <w:t>720</w:t>
+              <w:t>361</w:t>
             </w:r>
           </w:p>
         </w:tc>
@@ -2708,7 +2706,7 @@
           </w:tcPr>
           <w:p>
             <w:r>
-              <w:t>G3-CarhartGeom</w:t>
+              <w:t>G4a</w:t>
             </w:r>
           </w:p>
         </w:tc>
@@ -2718,7 +2716,7 @@
           </w:tcPr>
           <w:p>
             <w:r>
-              <w:t>Carhart様幾何（発現例のみ）</w:t>
+              <w:t>周波数別上下限（症例単位：数値閾値がP4範囲内）</w:t>
             </w:r>
           </w:p>
         </w:tc>
@@ -2728,7 +2726,7 @@
           </w:tcPr>
           <w:p>
             <w:r>
-              <w:t>576/576</w:t>
+              <w:t>9600/9600</w:t>
             </w:r>
           </w:p>
         </w:tc>
@@ -2738,7 +2736,7 @@
           </w:tcPr>
           <w:p>
             <w:r>
-              <w:t>576</w:t>
+              <w:t>9600</w:t>
             </w:r>
           </w:p>
         </w:tc>
@@ -2757,7 +2755,9 @@
             <w:tcW w:type="dxa" w:w="1440"/>
           </w:tcPr>
           <w:p>
-            <w:r/>
+            <w:r>
+              <w:t>境界値＝上下限一致は適合。超過・下回は不適合</w:t>
+            </w:r>
           </w:p>
         </w:tc>
       </w:tr>
@@ -2768,7 +2768,7 @@
           </w:tcPr>
           <w:p>
             <w:r>
-              <w:t>G3-AOM-Mixed</w:t>
+              <w:t>G4b</w:t>
             </w:r>
           </w:p>
         </w:tc>
@@ -2778,7 +2778,7 @@
           </w:tcPr>
           <w:p>
             <w:r>
-              <w:t>AOM混合型: 4k BC&gt;0.5k BC（付与例）</w:t>
+              <w:t>周波数別上下限（閾値点単位）</w:t>
             </w:r>
           </w:p>
         </w:tc>
@@ -2788,7 +2788,7 @@
           </w:tcPr>
           <w:p>
             <w:r>
-              <w:t>361/361</w:t>
+              <w:t>230400/230400</w:t>
             </w:r>
           </w:p>
         </w:tc>
@@ -2798,7 +2798,7 @@
           </w:tcPr>
           <w:p>
             <w:r>
-              <w:t>361</w:t>
+              <w:t>230400</w:t>
             </w:r>
           </w:p>
         </w:tc>
@@ -2890,7 +2890,7 @@
           </w:tcPr>
           <w:p>
             <w:r>
-              <w:t>T8</w:t>
+              <w:t>T6a</w:t>
             </w:r>
           </w:p>
         </w:tc>
@@ -2900,7 +2900,7 @@
           </w:tcPr>
           <w:p>
             <w:r>
-              <w:t>程度の非減少（正常以外・同一seed・一側は患側固定）</w:t>
+              <w:t>Carhart様・付与の有無（期待80%）</w:t>
             </w:r>
           </w:p>
         </w:tc>
@@ -2910,7 +2910,7 @@
           </w:tcPr>
           <w:p>
             <w:r>
-              <w:t>540/540</w:t>
+              <w:t>160/200</w:t>
             </w:r>
           </w:p>
         </w:tc>
@@ -2920,7 +2920,7 @@
           </w:tcPr>
           <w:p>
             <w:r>
-              <w:t>540</w:t>
+              <w:t>200</w:t>
             </w:r>
           </w:p>
         </w:tc>
@@ -2930,7 +2930,7 @@
           </w:tcPr>
           <w:p>
             <w:r>
-              <w:t>100</w:t>
+              <w:t>80</w:t>
             </w:r>
           </w:p>
         </w:tc>
@@ -2940,7 +2940,7 @@
           </w:tcPr>
           <w:p>
             <w:r>
-              <w:t>9プロファイル各60/60（計540）。内訳は表下の注を参照。</w:t>
+              <w:t>同じ200件での付与 160/200=80.0% (95%CI 73.9–85.0%)。許容帯70–90%は凍結正解表で事前設定。95%CIはWilson法。帯内のため試験合格</w:t>
             </w:r>
           </w:p>
         </w:tc>
@@ -2952,7 +2952,7 @@
           </w:tcPr>
           <w:p>
             <w:r>
-              <w:t>T7</w:t>
+              <w:t>T6b</w:t>
             </w:r>
           </w:p>
         </w:tc>
@@ -2962,7 +2962,7 @@
           </w:tcPr>
           <w:p>
             <w:r>
-              <w:t>Sudden一側差≥30 dB（焦点: 程度2固定）</w:t>
+              <w:t>Carhart様・付与例の形（T6aと同じ200件）</w:t>
             </w:r>
           </w:p>
         </w:tc>
@@ -2972,7 +2972,7 @@
           </w:tcPr>
           <w:p>
             <w:r>
-              <w:t>200/200</w:t>
+              <w:t>160/160</w:t>
             </w:r>
           </w:p>
         </w:tc>
@@ -2982,7 +2982,7 @@
           </w:tcPr>
           <w:p>
             <w:r>
-              <w:t>200</w:t>
+              <w:t>160</w:t>
             </w:r>
           </w:p>
         </w:tc>
@@ -3002,7 +3002,7 @@
           </w:tcPr>
           <w:p>
             <w:r>
-              <w:t>焦点差中央値 51.7 dB（グリッドの程度≥1規則と同じ30 dB床）</w:t>
+              <w:t>T6aで付与された160件の形（160/160）</w:t>
             </w:r>
           </w:p>
         </w:tc>
@@ -3014,7 +3014,7 @@
           </w:tcPr>
           <w:p>
             <w:r>
-              <w:t>T6a</w:t>
+              <w:t>T6c</w:t>
             </w:r>
           </w:p>
         </w:tc>
@@ -3024,7 +3024,7 @@
           </w:tcPr>
           <w:p>
             <w:r>
-              <w:t>Carhart様・付与の有無（期待80%）</w:t>
+              <w:t>AOM混合型・付与の有無（教育用50%）</w:t>
             </w:r>
           </w:p>
         </w:tc>
@@ -3034,7 +3034,7 @@
           </w:tcPr>
           <w:p>
             <w:r>
-              <w:t>160/200</w:t>
+              <w:t>101/200</w:t>
             </w:r>
           </w:p>
         </w:tc>
@@ -3054,7 +3054,7 @@
           </w:tcPr>
           <w:p>
             <w:r>
-              <w:t>80</w:t>
+              <w:t>50.5</w:t>
             </w:r>
           </w:p>
         </w:tc>
@@ -3064,7 +3064,7 @@
           </w:tcPr>
           <w:p>
             <w:r>
-              <w:t>同じ200件での付与 160/200=80.0% (95%CI 73.9–85.0%)。許容帯70–90%は凍結正解表で事前設定。95%CIはWilson法。帯内のため試験合格</w:t>
+              <w:t>同じ200件での付与 101/200=50.5% (95%CI 43.6–57.4%)。許容帯40–60%は凍結正解表で事前設定。95%CIはWilson法。帯内のため試験合格。臨床発生率ではない</w:t>
             </w:r>
           </w:p>
         </w:tc>
@@ -3076,7 +3076,7 @@
           </w:tcPr>
           <w:p>
             <w:r>
-              <w:t>T6b</w:t>
+              <w:t>T6d</w:t>
             </w:r>
           </w:p>
         </w:tc>
@@ -3086,7 +3086,7 @@
           </w:tcPr>
           <w:p>
             <w:r>
-              <w:t>Carhart様・付与例の形（T6aと同じ200件）</w:t>
+              <w:t>AOM混合型・付与例の形（T6cと同じ200件）</w:t>
             </w:r>
           </w:p>
         </w:tc>
@@ -3096,7 +3096,7 @@
           </w:tcPr>
           <w:p>
             <w:r>
-              <w:t>160/160</w:t>
+              <w:t>101/101</w:t>
             </w:r>
           </w:p>
         </w:tc>
@@ -3106,7 +3106,7 @@
           </w:tcPr>
           <w:p>
             <w:r>
-              <w:t>160</w:t>
+              <w:t>101</w:t>
             </w:r>
           </w:p>
         </w:tc>
@@ -3126,7 +3126,7 @@
           </w:tcPr>
           <w:p>
             <w:r>
-              <w:t>T6aで付与された160件の形（160/160）</w:t>
+              <w:t>T6cで付与された101件の形（101/101）</w:t>
             </w:r>
           </w:p>
         </w:tc>
@@ -3138,7 +3138,7 @@
           </w:tcPr>
           <w:p>
             <w:r>
-              <w:t>T6c</w:t>
+              <w:t>T7</w:t>
             </w:r>
           </w:p>
         </w:tc>
@@ -3148,7 +3148,7 @@
           </w:tcPr>
           <w:p>
             <w:r>
-              <w:t>AOM混合型・付与の有無（教育用50%）</w:t>
+              <w:t>Sudden一側差≥30 dB（焦点: 程度2固定）</w:t>
             </w:r>
           </w:p>
         </w:tc>
@@ -3158,7 +3158,7 @@
           </w:tcPr>
           <w:p>
             <w:r>
-              <w:t>101/200</w:t>
+              <w:t>200/200</w:t>
             </w:r>
           </w:p>
         </w:tc>
@@ -3178,7 +3178,7 @@
           </w:tcPr>
           <w:p>
             <w:r>
-              <w:t>50.5</w:t>
+              <w:t>100</w:t>
             </w:r>
           </w:p>
         </w:tc>
@@ -3188,7 +3188,7 @@
           </w:tcPr>
           <w:p>
             <w:r>
-              <w:t>同じ200件での付与 101/200=50.5% (95%CI 43.6–57.4%)。許容帯40–60%は凍結正解表で事前設定。95%CIはWilson法。帯内のため試験合格。臨床発生率ではない</w:t>
+              <w:t>焦点差中央値 51.7 dB（グリッドの程度≥1規則と同じ30 dB床）</w:t>
             </w:r>
           </w:p>
         </w:tc>
@@ -3200,7 +3200,7 @@
           </w:tcPr>
           <w:p>
             <w:r>
-              <w:t>T6d</w:t>
+              <w:t>T8</w:t>
             </w:r>
           </w:p>
         </w:tc>
@@ -3210,7 +3210,7 @@
           </w:tcPr>
           <w:p>
             <w:r>
-              <w:t>AOM混合型・付与例の形（T6cと同じ200件）</w:t>
+              <w:t>程度の非減少（正常以外・同一seed・一側は患側固定）</w:t>
             </w:r>
           </w:p>
         </w:tc>
@@ -3220,7 +3220,7 @@
           </w:tcPr>
           <w:p>
             <w:r>
-              <w:t>101/101</w:t>
+              <w:t>540/540</w:t>
             </w:r>
           </w:p>
         </w:tc>
@@ -3230,7 +3230,7 @@
           </w:tcPr>
           <w:p>
             <w:r>
-              <w:t>101</w:t>
+              <w:t>540</w:t>
             </w:r>
           </w:p>
         </w:tc>
@@ -3250,7 +3250,7 @@
           </w:tcPr>
           <w:p>
             <w:r>
-              <w:t>T6cで付与された101件の形（101/101）</w:t>
+              <w:t>9プロファイル各60/60（計540）。内訳は表下の注を参照。</w:t>
             </w:r>
           </w:p>
         </w:tc>
@@ -3851,7 +3851,7 @@
     </w:p>
     <w:p>
       <w:r>
-        <w:t>・一側差 Mumps 程度1／2／3：中央値89.2／90.0／96.7 dB（各n=240）。</w:t>
+        <w:t>・一側差 Mumps 程度1／2／3：中央値89.2／90.0／96.7 dB（各n=240）。程度≥1全体（n=720）の中央値は95.0 dB（四分位範囲86.7–106.7、範囲78.3–108.3）。</w:t>
       </w:r>
     </w:p>
     <w:p>
@@ -3879,7 +3879,7 @@
     </w:p>
     <w:p>
       <w:r>
-        <w:t>正常・適合データ13項目と規則違反データ18項目の計31項目。規則違反18件はすべて不適合と判定された。識別子は歴史的経緯からM1–M20を用いるが、欠番はM9・M11である（振り直しは行っていない）。</w:t>
+        <w:t>正常・適合データ13項目と規則違反データ18項目の計31項目。規則違反18件はすべて不適合と判定された。識別子は歴史的経緯からM1–M20を用いるが、欠番はM9・M11である（振り直しは行っていない）。これとは別に、主要パターンを網羅するよう選んだ代表生成例24件について、著者が気導・骨導値と主要規則を手計算で照合し、全例が設定規則に一致した（条件・seedの一覧は verification/HANDCHECK_cases_24.md。異常系31項目の部分集合ではない）。</w:t>
       </w:r>
     </w:p>
     <w:tbl>
@@ -4576,7 +4576,7 @@
     </w:p>
     <w:p>
       <w:r>
-        <w:t>・T7は程度2固定の焦点検証であり、程度別記述統計とは対象が異なる。規則床は程度≥1と同じ≥30 dB。</w:t>
+        <w:t>・適合率表のIDは歴史的経緯による。T2–T5およびT9は欠番であり、振り直しは行っていない（M9・M11と同様）。・T1・T6–T8・T10・T11は焦点検証、G*は主に9,600件グリッド由来である。・T7は程度2固定の焦点検証であり、表2および程度別記述統計（程度≥1）とは対象が異なる。規則床は程度≥1と同じ≥30 dB。</w:t>
       </w:r>
     </w:p>
     <w:p>

</xml_diff>

<commit_message>
Replace technical 床 wording with 下限 in JAMT materials.
Use clearer lower-bound language in the manuscript, supplements, verification notes, and generator comments while leaving 臨床 unchanged.

Co-authored-by: Cursor <cursoragent@cursor.com>
</commit_message>
<xml_diff>
--- a/docs/pilot-study/manuscripts/Supplement1_verification.docx
+++ b/docs/pilot-study/manuscripts/Supplement1_verification.docx
@@ -50,7 +50,7 @@
     </w:p>
     <w:p>
       <w:r>
-        <w:t>・検証スクリプトは生成プログラムとは別ファイル（scripts/lib/audiogramRuleChecks.mjs）に判定関数を実装した。症例生成のため生成関数を呼び出すが、合否判定式は生成器内部の拘束ルーチンを共有しない。一部の定数（最小ABG床・周波数別上下限など）は双方に同値を重複定義し、凍結正解表と突合して管理した。周波数別上下限（G4a／G4b）は生成器のEngineConstantsを参照せず、検証側に別定義した上下限表と比較する（値は生成器LIMITSおよびRULE_SPEC P4と同値）。同一著者・同一仕様に基づく確認であり、外部機関による第三者検証ではない。</w:t>
+        <w:t>・検証スクリプトは生成プログラムとは別ファイル（scripts/lib/audiogramRuleChecks.mjs）に判定関数を実装した。症例生成のため生成関数を呼び出すが、合否判定式は生成器内部の拘束ルーチンを共有しない。一部の定数（最小ABG下限・周波数別上下限など）は双方に同値を重複定義し、凍結正解表と突合して管理した。周波数別上下限（G4a／G4b）は生成器のEngineConstantsを参照せず、検証側に別定義した上下限表と比較する（値は生成器LIMITSおよびRULE_SPEC P4と同値）。同一著者・同一仕様に基づく確認であり、外部機関による第三者検証ではない。</w:t>
       </w:r>
     </w:p>
     <w:p>
@@ -65,7 +65,7 @@
     </w:p>
     <w:p>
       <w:r>
-        <w:t>・急性中耳炎の混合型：程度≥1で教育用Bernoulli試行（付与率50%）。臨床発生率の再現ではない。最小ABG床は滲出性中耳炎と同一。</w:t>
+        <w:t>・急性中耳炎の混合型：程度≥1で教育用Bernoulli試行（付与率50%）。臨床発生率の再現ではない。最小ABG下限は滲出性中耳炎と同一。</w:t>
       </w:r>
     </w:p>
     <w:p>
@@ -1894,12 +1894,12 @@
         <w:rPr>
           <w:b/>
         </w:rPr>
-        <w:t>1d．伝音パターンの最小ABG床（G3-CHL判定に使用）</w:t>
+        <w:t>1d．伝音パターンの最小ABG下限（G3-CHL判定に使用）</w:t>
       </w:r>
     </w:p>
     <w:p>
       <w:r>
-        <w:t>対象周波数のみ最小気骨導差（ABG＝気導−骨導）を課す。値はdB。未記載周波数は最小ABG床なし（ただし骨導測定周波数では教育用に骨導≤気導＋5 dB）。滲出性中耳炎と急性中耳炎は同一床。検証側MIN_ABG表（audiogramRuleChecks.mjs）および生成器のminMapsと同値。</w:t>
+        <w:t>対象周波数のみ最小気骨導差（ABG＝気導−骨導）を課す。値はdB。未記載周波数は最小ABG下限なし（ただし骨導測定周波数では教育用に骨導≤気導＋5 dB）。滲出性中耳炎と急性中耳炎は同一下限。検証側MIN_ABG表（audiogramRuleChecks.mjs）および生成器のminMapsと同値。</w:t>
       </w:r>
     </w:p>
     <w:tbl>
@@ -2792,7 +2792,7 @@
           </w:tcPr>
           <w:p>
             <w:r>
-              <w:t>Coles参考の著者設定（10 dB床）</w:t>
+              <w:t>Coles参考の著者設定（10 dB下限）</w:t>
             </w:r>
           </w:p>
         </w:tc>
@@ -3526,7 +3526,7 @@
           </w:tcPr>
           <w:p>
             <w:r>
-              <w:t>焦点差中央値 51.7 dB（グリッドの程度≥1規則と同じ30 dB床）</w:t>
+              <w:t>焦点差中央値 51.7 dB（グリッドの程度≥1規則と同じ30 dB下限）</w:t>
             </w:r>
           </w:p>
         </w:tc>
@@ -4639,7 +4639,7 @@
     </w:p>
     <w:p>
       <w:r>
-        <w:t>・ムンプス難聴の高度床（程度≥1）：病側平均気導≥70 dBかつ一側差≥55 dB。学習者向け無作為選択では軽度を選ばないが、検証グリッドでは程度1も明示指定で生成し、深度は中等度相当として高度床を満たす。</w:t>
+        <w:t>・ムンプス難聴の高度下限（程度≥1）：病側平均気導≥70 dBかつ一側差≥55 dB。学習者向け無作為選択では軽度を選ばないが、検証グリッドでは程度1も明示指定で生成し、深度は中等度相当として高度下限を満たす。</w:t>
       </w:r>
     </w:p>
     <w:p>
@@ -4649,12 +4649,12 @@
     </w:p>
     <w:p>
       <w:r>
-        <w:t>・C5-dipの深さ：4 kHz−2 kHzおよび4 kHz−8 kHz（気導、程度≥1）。規則は双方に10 dB床を課す。</w:t>
+        <w:t>・C5-dipの深さ：4 kHz−2 kHzおよび4 kHz−8 kHz（気導、程度≥1）。規則は双方に10 dB下限を課す。</w:t>
       </w:r>
     </w:p>
     <w:p>
       <w:r>
-        <w:t>・Carhart様の深さ：BC 2 kHz − mean(BC 1 kHz, BC 4 kHz)（付与例）。深さ床は5 dB。</w:t>
+        <w:t>・Carhart様の深さ：BC 2 kHz − mean(BC 1 kHz, BC 4 kHz)（付与例）。深さ下限は5 dB。</w:t>
       </w:r>
     </w:p>
     <w:p>
@@ -4737,7 +4737,7 @@
     </w:p>
     <w:p>
       <w:r>
-        <w:t>・床規則の別掲（全周波数SOを除く）：突発一側差 694/694、突発程度3 214/214、ムンプス 366/366。「0.5/1/2 kHzにSOなし」再集計も同数となるが、全周波数SO以外では当該3周波にSOが生じない構造上一致するためである。</w:t>
+        <w:t>・下限規則の別掲（全周波数SOを除く）：突発一側差 694/694、突発程度3 214/214、ムンプス 366/366。「0.5/1/2 kHzにSOなし」再集計も同数となるが、全周波数SO以外では当該3周波にSOが生じない構造上一致するためである。</w:t>
       </w:r>
     </w:p>
     <w:p>
@@ -6637,7 +6637,7 @@
           </w:tcPr>
           <w:p>
             <w:r>
-              <w:t>正常・適合データ（上限境界・ムンプス床を含む）</w:t>
+              <w:t>正常・適合データ（上限境界・ムンプス下限を含む）</w:t>
             </w:r>
           </w:p>
         </w:tc>
@@ -7181,7 +7181,7 @@
           </w:tcPr>
           <w:p>
             <w:r>
-              <w:t>C5-dipが5 dBのみ（10 dB床未満）</w:t>
+              <w:t>C5-dipが5 dBのみ（10 dB下限未満）</w:t>
             </w:r>
           </w:p>
         </w:tc>
@@ -7213,7 +7213,7 @@
           </w:tcPr>
           <w:p>
             <w:r>
-              <w:t>ムンプスで病側平均が高度床未満</w:t>
+              <w:t>ムンプスで病側平均が高度下限未満</w:t>
             </w:r>
           </w:p>
         </w:tc>
@@ -7271,7 +7271,7 @@
     </w:p>
     <w:p>
       <w:r>
-        <w:t>・適合率表のIDは歴史的経緯による。T2–T5およびT9は欠番であり、振り直しは行っていない（M9・M11と同様）。T1・T6–T8・T10・T11は焦点検証、G*は主に9,600件グリッド由来である。T7は程度2固定の焦点検証であり、表2および程度別記述統計（程度≥1）とは対象が異なる。規則床は程度≥1と同じ≥30 dB。</w:t>
+        <w:t>・適合率表のIDは歴史的経緯による。T2–T5およびT9は欠番であり、振り直しは行っていない（M9・M11と同様）。T1・T6–T8・T10・T11は焦点検証、G*は主に9,600件グリッド由来である。T7は程度2固定の焦点検証であり、表2および程度別記述統計（程度≥1）とは対象が異なる。規則下限は程度≥1と同じ≥30 dB。</w:t>
       </w:r>
     </w:p>
     <w:p>
@@ -7285,6 +7285,8 @@
       </w:r>
     </w:p>
     <w:sectPr>
+      <w:headerReference w:type="default" r:id="rId9"/>
+      <w:footerReference w:type="default" r:id="rId10"/>
       <w:pgSz w:w="12240" w:h="15840"/>
       <w:pgMar w:top="1440" w:right="1800" w:bottom="1440" w:left="1800" w:header="720" w:footer="720" w:gutter="0"/>
       <w:cols w:space="720"/>
@@ -7292,6 +7294,26 @@
     </w:sectPr>
   </w:body>
 </w:document>
+</file>
+
+<file path=word/footer1.xml><?xml version="1.0" encoding="utf-8"?>
+<w:ftr xmlns:m="http://schemas.openxmlformats.org/officeDocument/2006/math" xmlns:mc="http://schemas.openxmlformats.org/markup-compatibility/2006" xmlns:mo="http://schemas.microsoft.com/office/mac/office/2008/main" xmlns:mv="urn:schemas-microsoft-com:mac:vml" xmlns:o="urn:schemas-microsoft-com:office:office" xmlns:r="http://schemas.openxmlformats.org/officeDocument/2006/relationships" xmlns:v="urn:schemas-microsoft-com:vml" xmlns:w10="urn:schemas-microsoft-com:office:word" xmlns:w14="http://schemas.microsoft.com/office/word/2010/wordml" xmlns:w="http://schemas.openxmlformats.org/wordprocessingml/2006/main" xmlns:wne="http://schemas.microsoft.com/office/word/2006/wordml" xmlns:wp14="http://schemas.microsoft.com/office/word/2010/wordprocessingDrawing" xmlns:wp="http://schemas.openxmlformats.org/drawingml/2006/wordprocessingDrawing" xmlns:wpc="http://schemas.microsoft.com/office/word/2010/wordprocessingCanvas" xmlns:wpg="http://schemas.microsoft.com/office/word/2010/wordprocessingGroup" xmlns:wpi="http://schemas.microsoft.com/office/word/2010/wordprocessingInk" xmlns:wps="http://schemas.microsoft.com/office/word/2010/wordprocessingShape" mc:Ignorable="w14 wp14">
+  <w:p>
+    <w:pPr>
+      <w:pStyle w:val="Footer"/>
+    </w:pPr>
+  </w:p>
+</w:ftr>
+</file>
+
+<file path=word/header1.xml><?xml version="1.0" encoding="utf-8"?>
+<w:hdr xmlns:m="http://schemas.openxmlformats.org/officeDocument/2006/math" xmlns:mc="http://schemas.openxmlformats.org/markup-compatibility/2006" xmlns:mo="http://schemas.microsoft.com/office/mac/office/2008/main" xmlns:mv="urn:schemas-microsoft-com:mac:vml" xmlns:o="urn:schemas-microsoft-com:office:office" xmlns:r="http://schemas.openxmlformats.org/officeDocument/2006/relationships" xmlns:v="urn:schemas-microsoft-com:vml" xmlns:w10="urn:schemas-microsoft-com:office:word" xmlns:w14="http://schemas.microsoft.com/office/word/2010/wordml" xmlns:w="http://schemas.openxmlformats.org/wordprocessingml/2006/main" xmlns:wne="http://schemas.microsoft.com/office/word/2006/wordml" xmlns:wp14="http://schemas.microsoft.com/office/word/2010/wordprocessingDrawing" xmlns:wp="http://schemas.openxmlformats.org/drawingml/2006/wordprocessingDrawing" xmlns:wpc="http://schemas.microsoft.com/office/word/2010/wordprocessingCanvas" xmlns:wpg="http://schemas.microsoft.com/office/word/2010/wordprocessingGroup" xmlns:wpi="http://schemas.microsoft.com/office/word/2010/wordprocessingInk" xmlns:wps="http://schemas.microsoft.com/office/word/2010/wordprocessingShape" mc:Ignorable="w14 wp14">
+  <w:p>
+    <w:pPr>
+      <w:pStyle w:val="Header"/>
+    </w:pPr>
+  </w:p>
+</w:hdr>
 </file>
 
 <file path=word/numbering.xml><?xml version="1.0" encoding="utf-8"?>

</xml_diff>